<commit_message>
a whole bunch of shit
</commit_message>
<xml_diff>
--- a/numeric/experiment/resources/TaskInstructions.docx
+++ b/numeric/experiment/resources/TaskInstructions.docx
@@ -53,7 +53,19 @@
         <w:t>pairs</w:t>
       </w:r>
       <w:r>
-        <w:t xml:space="preserve"> of monetary lotteries. In total, you will make 400 decisions, separated into 2 blocks of 200 trials each. </w:t>
+        <w:t xml:space="preserve"> of monetary lotteries. In total, you will make 400 decisions, separated into </w:t>
+      </w:r>
+      <w:r>
+        <w:t>4</w:t>
+      </w:r>
+      <w:r>
+        <w:t xml:space="preserve"> blocks of </w:t>
+      </w:r>
+      <w:r>
+        <w:t>1</w:t>
+      </w:r>
+      <w:r>
+        <w:t xml:space="preserve">00 trials each. </w:t>
       </w:r>
     </w:p>
     <w:p/>
@@ -65,6 +77,9 @@
         <w:t xml:space="preserve">alf of </w:t>
       </w:r>
       <w:r>
+        <w:t xml:space="preserve">the </w:t>
+      </w:r>
+      <w:r>
         <w:t>decisions will involve</w:t>
       </w:r>
       <w:r>
@@ -89,16 +104,11 @@
         <w:t xml:space="preserve">money </w:t>
       </w:r>
       <w:r>
-        <w:t xml:space="preserve">with some </w:t>
-      </w:r>
-      <w:proofErr w:type="gramStart"/>
-      <w:r>
-        <w:t xml:space="preserve">probability, </w:t>
+        <w:t xml:space="preserve">with some probability, </w:t>
       </w:r>
       <w:r>
         <w:t>or</w:t>
       </w:r>
-      <w:proofErr w:type="gramEnd"/>
       <w:r>
         <w:t xml:space="preserve"> getting $0 otherwise. </w:t>
       </w:r>
@@ -115,16 +125,11 @@
         <w:t>money</w:t>
       </w:r>
       <w:r>
-        <w:t xml:space="preserve"> with some </w:t>
-      </w:r>
-      <w:proofErr w:type="gramStart"/>
-      <w:r>
-        <w:t xml:space="preserve">probability, </w:t>
+        <w:t xml:space="preserve"> with some probability, </w:t>
       </w:r>
       <w:r>
         <w:t>or</w:t>
       </w:r>
-      <w:proofErr w:type="gramEnd"/>
       <w:r>
         <w:t xml:space="preserve"> getting $0 otherwise. </w:t>
       </w:r>
@@ -147,111 +152,114 @@
         <w:t xml:space="preserve">. In addition, at the end of the experiment </w:t>
       </w:r>
       <w:r>
-        <w:t>you</w:t>
+        <w:t xml:space="preserve">you </w:t>
+      </w:r>
+      <w:r>
+        <w:t xml:space="preserve">will randomly select one </w:t>
+      </w:r>
+      <w:r>
+        <w:t>GAIN trial and one LOSS trial</w:t>
+      </w:r>
+      <w:r>
+        <w:t xml:space="preserve"> and play out the </w:t>
+      </w:r>
+      <w:r>
+        <w:t>lotteries</w:t>
       </w:r>
       <w:r>
         <w:t xml:space="preserve"> </w:t>
       </w:r>
       <w:r>
-        <w:t xml:space="preserve">will randomly select one </w:t>
-      </w:r>
-      <w:r>
-        <w:t>GAIN trial and one LOSS trial</w:t>
-      </w:r>
-      <w:r>
-        <w:t xml:space="preserve"> and play out the </w:t>
+        <w:t xml:space="preserve">that you chose </w:t>
+      </w:r>
+      <w:r>
+        <w:t>in those trials</w:t>
+      </w:r>
+      <w:r>
+        <w:t xml:space="preserve">. The selected </w:t>
+      </w:r>
+      <w:r>
+        <w:t xml:space="preserve">lotteries </w:t>
+      </w:r>
+      <w:r>
+        <w:t>will then be played by drawing marbles from an urn to determine your final payoff. Note that wins will be added to the $40 show-up fee, but losses will be subtracted.</w:t>
+      </w:r>
+    </w:p>
+    <w:p/>
+    <w:p>
+      <w:r>
+        <w:t>Here are more details</w:t>
+      </w:r>
+      <w:r>
+        <w:t>.</w:t>
+      </w:r>
+    </w:p>
+    <w:p/>
+    <w:p>
+      <w:pPr>
+        <w:rPr>
+          <w:b/>
+        </w:rPr>
+      </w:pPr>
+    </w:p>
+    <w:p>
+      <w:pPr>
+        <w:rPr>
+          <w:b/>
+        </w:rPr>
+      </w:pPr>
+      <w:r>
+        <w:rPr>
+          <w:b/>
+        </w:rPr>
+        <w:t>GAIN</w:t>
+      </w:r>
+      <w:r>
+        <w:rPr>
+          <w:b/>
+        </w:rPr>
+        <w:t xml:space="preserve"> </w:t>
+      </w:r>
+      <w:r>
+        <w:rPr>
+          <w:b/>
+        </w:rPr>
+        <w:t>BLOCKS</w:t>
+      </w:r>
+    </w:p>
+    <w:p>
+      <w:pPr>
+        <w:rPr>
+          <w:b/>
+        </w:rPr>
+      </w:pPr>
+    </w:p>
+    <w:p>
+      <w:r>
+        <w:t xml:space="preserve">In </w:t>
+      </w:r>
+      <w:r>
+        <w:t>GAIN</w:t>
+      </w:r>
+      <w:r>
+        <w:t xml:space="preserve"> </w:t>
+      </w:r>
+      <w:r>
+        <w:t>decisions</w:t>
+      </w:r>
+      <w:r>
+        <w:t xml:space="preserve">, you will be shown </w:t>
+      </w:r>
+      <w:r>
+        <w:t>2</w:t>
+      </w:r>
+      <w:r>
+        <w:t xml:space="preserve"> </w:t>
       </w:r>
       <w:r>
         <w:t>lotteries</w:t>
       </w:r>
       <w:r>
-        <w:t xml:space="preserve"> </w:t>
-      </w:r>
-      <w:r>
-        <w:t xml:space="preserve">that you chose </w:t>
-      </w:r>
-      <w:r>
-        <w:t>in those trials</w:t>
-      </w:r>
-      <w:r>
-        <w:t xml:space="preserve">. The selected </w:t>
-      </w:r>
-      <w:r>
-        <w:t xml:space="preserve">lotteries </w:t>
-      </w:r>
-      <w:r>
-        <w:t>will then be played by drawing marbles from an urn to determine your final payoff. Note that wins will be added to the $40 show-up fee, but losses will be subtracted.</w:t>
-      </w:r>
-    </w:p>
-    <w:p/>
-    <w:p>
-      <w:r>
-        <w:t>Here are more details</w:t>
-      </w:r>
-      <w:r>
-        <w:t>.</w:t>
-      </w:r>
-    </w:p>
-    <w:p/>
-    <w:p>
-      <w:pPr>
-        <w:rPr>
-          <w:b/>
-        </w:rPr>
-      </w:pPr>
-    </w:p>
-    <w:p>
-      <w:pPr>
-        <w:rPr>
-          <w:b/>
-        </w:rPr>
-      </w:pPr>
-      <w:r>
-        <w:rPr>
-          <w:b/>
-        </w:rPr>
-        <w:t>GAIN</w:t>
-      </w:r>
-      <w:r>
-        <w:rPr>
-          <w:b/>
-        </w:rPr>
-        <w:t xml:space="preserve"> BLOCK</w:t>
-      </w:r>
-    </w:p>
-    <w:p>
-      <w:pPr>
-        <w:rPr>
-          <w:b/>
-        </w:rPr>
-      </w:pPr>
-    </w:p>
-    <w:p>
-      <w:r>
-        <w:t xml:space="preserve">In </w:t>
-      </w:r>
-      <w:r>
-        <w:t>GAIN</w:t>
-      </w:r>
-      <w:r>
-        <w:t xml:space="preserve"> </w:t>
-      </w:r>
-      <w:r>
-        <w:t>decisions</w:t>
-      </w:r>
-      <w:r>
-        <w:t xml:space="preserve">, you will be shown </w:t>
-      </w:r>
-      <w:r>
-        <w:t>2</w:t>
-      </w:r>
-      <w:r>
-        <w:t xml:space="preserve"> </w:t>
-      </w:r>
-      <w:r>
-        <w:t>lotteries</w:t>
-      </w:r>
-      <w:r>
         <w:t>, one on the left</w:t>
       </w:r>
       <w:r>
@@ -264,18 +272,10 @@
         <w:t>Each GAIN lottery entails earning some positive amount of money ($6</w:t>
       </w:r>
       <w:r>
-        <w:t xml:space="preserve"> to $12) with some </w:t>
-      </w:r>
-      <w:proofErr w:type="gramStart"/>
-      <w:r>
-        <w:t>probability</w:t>
-      </w:r>
-      <w:r>
-        <w:t>, or</w:t>
-      </w:r>
-      <w:proofErr w:type="gramEnd"/>
-      <w:r>
-        <w:t xml:space="preserve"> getting $0 otherwise. </w:t>
+        <w:t xml:space="preserve"> to $12) with some probability</w:t>
+      </w:r>
+      <w:r>
+        <w:t xml:space="preserve">, or getting $0 otherwise. </w:t>
       </w:r>
     </w:p>
     <w:p/>
@@ -359,18 +359,10 @@
         <w:t>s</w:t>
       </w:r>
       <w:r>
-        <w:t xml:space="preserve">. You must maintain fixation on the cross </w:t>
-      </w:r>
-      <w:proofErr w:type="gramStart"/>
-      <w:r>
-        <w:t xml:space="preserve">in order </w:t>
-      </w:r>
-      <w:r>
-        <w:t>for</w:t>
-      </w:r>
-      <w:proofErr w:type="gramEnd"/>
-      <w:r>
-        <w:t xml:space="preserve"> the experiment </w:t>
+        <w:t xml:space="preserve">. You must maintain fixation on the cross in order </w:t>
+      </w:r>
+      <w:r>
+        <w:t xml:space="preserve">for the experiment </w:t>
       </w:r>
       <w:r>
         <w:t>to proceed</w:t>
@@ -816,7 +808,20 @@
         </w:numPr>
       </w:pPr>
       <w:r>
-        <w:t xml:space="preserve">You have 6 seconds to make your decision. If you do not make your choice within 6 seconds, then </w:t>
+        <w:lastRenderedPageBreak/>
+        <w:t xml:space="preserve">You have </w:t>
+      </w:r>
+      <w:r>
+        <w:t>10</w:t>
+      </w:r>
+      <w:r>
+        <w:t xml:space="preserve"> seconds to make your decision. If you do not make your choice within </w:t>
+      </w:r>
+      <w:r>
+        <w:t>10</w:t>
+      </w:r>
+      <w:r>
+        <w:t xml:space="preserve"> seconds, then </w:t>
       </w:r>
       <w:r>
         <w:t>your choice is automatically logged as the lottery with the worse expected value and a screen</w:t>
@@ -915,6 +920,12 @@
         </w:rPr>
         <w:t>LOSS BLOCK</w:t>
       </w:r>
+      <w:r>
+        <w:rPr>
+          <w:b/>
+        </w:rPr>
+        <w:t>S</w:t>
+      </w:r>
     </w:p>
     <w:p/>
     <w:p>
@@ -928,15 +939,7 @@
         <w:t xml:space="preserve">, </w:t>
       </w:r>
       <w:r>
-        <w:t xml:space="preserve">you will be shown 2 lotteries, one on the left and one on the right side of the screen. Each LOSS lottery entails losing some amount of money (-$6 to -$12) with some </w:t>
-      </w:r>
-      <w:proofErr w:type="gramStart"/>
-      <w:r>
-        <w:t>probability, or</w:t>
-      </w:r>
-      <w:proofErr w:type="gramEnd"/>
-      <w:r>
-        <w:t xml:space="preserve"> getting $0 otherwise.</w:t>
+        <w:t>you will be shown 2 lotteries, one on the left and one on the right side of the screen. Each LOSS lottery entails losing some amount of money (-$6 to -$12) with some probability, or getting $0 otherwise.</w:t>
       </w:r>
     </w:p>
     <w:p/>
@@ -966,18 +969,10 @@
         <w:spacing w:line="276" w:lineRule="auto"/>
       </w:pPr>
       <w:r>
-        <w:t xml:space="preserve">A fixation cross will appear in the left, center, or right of the screen, as shown in the following screenshots. You must maintain fixation on the cross </w:t>
-      </w:r>
-      <w:proofErr w:type="gramStart"/>
-      <w:r>
-        <w:t xml:space="preserve">in order </w:t>
-      </w:r>
-      <w:r>
-        <w:t>for</w:t>
-      </w:r>
-      <w:proofErr w:type="gramEnd"/>
-      <w:r>
-        <w:t xml:space="preserve"> the experiment </w:t>
+        <w:t xml:space="preserve">A fixation cross will appear in the left, center, or right of the screen, as shown in the following screenshots. You must maintain fixation on the cross in order </w:t>
+      </w:r>
+      <w:r>
+        <w:t xml:space="preserve">for the experiment </w:t>
       </w:r>
       <w:r>
         <w:t>to proceed.</w:t>
@@ -1200,6 +1195,7 @@
         <w:rPr>
           <w:color w:val="000000"/>
         </w:rPr>
+        <w:lastRenderedPageBreak/>
         <w:t>Two lotteries will appear on the screen. Make your choice by pressing either the LEFT or RIGHT Arrow Key at any time.</w:t>
       </w:r>
       <w:r>
@@ -1312,7 +1308,6 @@
         <w:rPr>
           <w:color w:val="000000"/>
         </w:rPr>
-        <w:lastRenderedPageBreak/>
         <w:t>After you make a response, the option selected will be briefly highlighted before moving to the next trial after a short pause.</w:t>
       </w:r>
     </w:p>
@@ -1416,7 +1411,19 @@
         </w:numPr>
       </w:pPr>
       <w:r>
-        <w:t>You have 6 seconds to make your decision. If you do not make your choice within 6 seconds, then your choice is automatically logged as the lottery with the worse expected value and a screen will appear to remind you to respond quicker!</w:t>
+        <w:t xml:space="preserve">You have </w:t>
+      </w:r>
+      <w:r>
+        <w:t>10</w:t>
+      </w:r>
+      <w:r>
+        <w:t xml:space="preserve"> seconds to make your decision. If you do not make your choice within </w:t>
+      </w:r>
+      <w:r>
+        <w:t>10</w:t>
+      </w:r>
+      <w:r>
+        <w:t xml:space="preserve"> seconds, then your choice is automatically logged as the lottery with the worse expected value and a screen will appear to remind you to respond quicker!</w:t>
       </w:r>
     </w:p>
     <w:p>
@@ -1509,6 +1516,7 @@
         <w:rPr>
           <w:b/>
         </w:rPr>
+        <w:lastRenderedPageBreak/>
         <w:t>IMPORTANT</w:t>
       </w:r>
     </w:p>
@@ -1559,7 +1567,6 @@
         </w:numPr>
         <w:spacing w:line="276" w:lineRule="auto"/>
       </w:pPr>
-      <w:proofErr w:type="gramStart"/>
       <w:r>
         <w:rPr>
           <w:b/>
@@ -1567,11 +1574,7 @@
         <w:t>Keep your hand on the response keys</w:t>
       </w:r>
       <w:r>
-        <w:t xml:space="preserve"> at all times</w:t>
-      </w:r>
-      <w:proofErr w:type="gramEnd"/>
-      <w:r>
-        <w:t xml:space="preserve"> during the task so that you do not need to look down at the keyboard in order to indicate your responses.</w:t>
+        <w:t xml:space="preserve"> at all times during the task so that you do not need to look down at the keyboard in order to indicate your responses.</w:t>
       </w:r>
     </w:p>
     <w:p>

</xml_diff>